<commit_message>
Add title page and Table of Contents
- Assignment.docx: dedicated title page (title, module, submission info,
  student-detail fields), then a live Word Table of Contents field on its
  own page, then the body. Page numbers auto-populate on open (Word's
  updateFields setting is enabled); users can also press F9 or right-click
  the TOC to refresh.
- Assignment.md: title block, then an anchor-linked Table of Contents with
  page numbers matching the DOCX layout.
- Assignment.txt: matching title block and TOC (page numbers only
  meaningful in the DOCX).
</commit_message>
<xml_diff>
--- a/Assignment.docx
+++ b/Assignment.docx
@@ -3,6 +3,26 @@
 <w:document xmlns:w="http://schemas.openxmlformats.org/wordprocessingml/2006/main">
   <w:body>
     <w:p>
+      <w:r>
+        <w:t xml:space="preserve"/>
+      </w:r>
+    </w:p>
+    <w:p>
+      <w:r>
+        <w:t xml:space="preserve"/>
+      </w:r>
+    </w:p>
+    <w:p>
+      <w:r>
+        <w:t xml:space="preserve"/>
+      </w:r>
+    </w:p>
+    <w:p>
+      <w:r>
+        <w:t xml:space="preserve"/>
+      </w:r>
+    </w:p>
+    <w:p>
       <w:pPr>
         <w:pStyle w:val="Title"/>
       </w:pPr>
@@ -11,6 +31,22 @@
       </w:r>
     </w:p>
     <w:p>
+      <w:pPr>
+        <w:pStyle w:val="Subtitle"/>
+      </w:pPr>
+      <w:r>
+        <w:t xml:space="preserve">Written Assignment</w:t>
+      </w:r>
+    </w:p>
+    <w:p>
+      <w:r>
+        <w:t xml:space="preserve"/>
+      </w:r>
+    </w:p>
+    <w:p>
+      <w:pPr>
+        <w:pStyle w:val="TitleMeta"/>
+      </w:pPr>
       <w:r>
         <w:rPr>
           <w:b/>
@@ -18,8 +54,13 @@
         <w:t xml:space="preserve">Degree:</w:t>
       </w:r>
       <w:r>
-        <w:t xml:space="preserve"> Computer Science and Digitisation </w:t>
-      </w:r>
+        <w:t xml:space="preserve"> Computer Science and Digitisation</w:t>
+      </w:r>
+    </w:p>
+    <w:p>
+      <w:pPr>
+        <w:pStyle w:val="TitleMeta"/>
+      </w:pPr>
       <w:r>
         <w:rPr>
           <w:b/>
@@ -27,66 +68,192 @@
         <w:t xml:space="preserve">Module:</w:t>
       </w:r>
       <w:r>
-        <w:t xml:space="preserve"> Statistics for Data Analysis </w:t>
-      </w:r>
+        <w:t xml:space="preserve"> Statistics for Data Analysis</w:t>
+      </w:r>
+    </w:p>
+    <w:p>
+      <w:pPr>
+        <w:pStyle w:val="TitleMeta"/>
+      </w:pPr>
       <w:r>
         <w:rPr>
           <w:b/>
         </w:rPr>
-        <w:t xml:space="preserve">Assignment Title:</w:t>
-      </w:r>
-      <w:r>
-        <w:t xml:space="preserve"> Statistics for Strategic Business Decision-Making </w:t>
-      </w:r>
+        <w:t xml:space="preserve">Assignment Type:</w:t>
+      </w:r>
+      <w:r>
+        <w:t xml:space="preserve"> Written assignment</w:t>
+      </w:r>
+    </w:p>
+    <w:p>
+      <w:pPr>
+        <w:pStyle w:val="TitleMeta"/>
+      </w:pPr>
       <w:r>
         <w:rPr>
           <w:b/>
         </w:rPr>
-        <w:t xml:space="preserve">Assignment Type:</w:t>
-      </w:r>
-      <w:r>
-        <w:t xml:space="preserve"> Written assignment </w:t>
-      </w:r>
+        <w:t xml:space="preserve">Word Limit:</w:t>
+      </w:r>
+      <w:r>
+        <w:t xml:space="preserve"> 2000 words (+/- 200)</w:t>
+      </w:r>
+    </w:p>
+    <w:p>
+      <w:pPr>
+        <w:pStyle w:val="TitleMeta"/>
+      </w:pPr>
       <w:r>
         <w:rPr>
           <w:b/>
         </w:rPr>
-        <w:t xml:space="preserve">Word Limit:</w:t>
-      </w:r>
-      <w:r>
-        <w:t xml:space="preserve"> 2000 words (+/- 200) </w:t>
-      </w:r>
+        <w:t xml:space="preserve">Weighting:</w:t>
+      </w:r>
+      <w:r>
+        <w:t xml:space="preserve"> 100%</w:t>
+      </w:r>
+    </w:p>
+    <w:p>
+      <w:pPr>
+        <w:pStyle w:val="TitleMeta"/>
+      </w:pPr>
       <w:r>
         <w:rPr>
           <w:b/>
         </w:rPr>
-        <w:t xml:space="preserve">Weighting:</w:t>
-      </w:r>
-      <w:r>
-        <w:t xml:space="preserve"> 100% </w:t>
-      </w:r>
+        <w:t xml:space="preserve">Issue Date:</w:t>
+      </w:r>
+      <w:r>
+        <w:t xml:space="preserve"> 18/06/2026</w:t>
+      </w:r>
+    </w:p>
+    <w:p>
+      <w:pPr>
+        <w:pStyle w:val="TitleMeta"/>
+      </w:pPr>
       <w:r>
         <w:rPr>
           <w:b/>
         </w:rPr>
-        <w:t xml:space="preserve">Issue Date:</w:t>
-      </w:r>
-      <w:r>
-        <w:t xml:space="preserve"> 18/06/2026 </w:t>
-      </w:r>
+        <w:t xml:space="preserve">Submission Date:</w:t>
+      </w:r>
+      <w:r>
+        <w:t xml:space="preserve"> 14/08/2026</w:t>
+      </w:r>
+    </w:p>
+    <w:p>
+      <w:pPr>
+        <w:pStyle w:val="TitleMeta"/>
+      </w:pPr>
       <w:r>
         <w:rPr>
           <w:b/>
         </w:rPr>
-        <w:t xml:space="preserve">Submission Date:</w:t>
-      </w:r>
-      <w:r>
-        <w:t xml:space="preserve"> 14/08/2026</w:t>
+        <w:t xml:space="preserve">Student Name:</w:t>
+      </w:r>
+      <w:r>
+        <w:t xml:space="preserve"> ______________________________</w:t>
+      </w:r>
+    </w:p>
+    <w:p>
+      <w:pPr>
+        <w:pStyle w:val="TitleMeta"/>
+      </w:pPr>
+      <w:r>
+        <w:rPr>
+          <w:b/>
+        </w:rPr>
+        <w:t xml:space="preserve">Student ID:</w:t>
+      </w:r>
+      <w:r>
+        <w:t xml:space="preserve"> ________________________________</w:t>
+      </w:r>
+    </w:p>
+    <w:p>
+      <w:pPr>
+        <w:pStyle w:val="TitleMeta"/>
+      </w:pPr>
+      <w:r>
+        <w:rPr>
+          <w:b/>
+        </w:rPr>
+        <w:t xml:space="preserve">Tutor:</w:t>
+      </w:r>
+      <w:r>
+        <w:t xml:space="preserve"> _____________________________________</w:t>
       </w:r>
     </w:p>
     <w:p>
       <w:r>
         <w:t xml:space="preserve"/>
+      </w:r>
+    </w:p>
+    <w:p>
+      <w:r>
+        <w:t xml:space="preserve"/>
+      </w:r>
+    </w:p>
+    <w:p>
+      <w:r>
+        <w:br w:type="page"/>
+      </w:r>
+    </w:p>
+    <w:p>
+      <w:pPr>
+        <w:pStyle w:val="TOCHeading"/>
+      </w:pPr>
+      <w:r>
+        <w:t xml:space="preserve">Table of Contents</w:t>
+      </w:r>
+    </w:p>
+    <w:sdt>
+      <w:sdtPr>
+        <w:id w:val="123456789"/>
+        <w:docPartObj>
+          <w:docPartGallery w:val="Table of Contents"/>
+          <w:docPartUnique/>
+        </w:docPartObj>
+      </w:sdtPr>
+      <w:sdtEndPr>
+        <w:rPr>
+          <w:rFonts w:asciiTheme="minorHAnsi" w:hAnsiTheme="minorHAnsi"/>
+        </w:rPr>
+      </w:sdtEndPr>
+      <w:sdtContent>
+        <w:p>
+          <w:pPr>
+            <w:pStyle w:val="TOC1"/>
+            <w:tabs>
+              <w:tab w:val="right" w:leader="dot" w:pos="9350"/>
+            </w:tabs>
+            <w:rPr>
+              <w:noProof/>
+            </w:rPr>
+          </w:pPr>
+          <w:r>
+            <w:fldChar w:fldCharType="begin" w:dirty="true"/>
+          </w:r>
+          <w:r>
+            <w:instrText xml:space="preserve"> TOC \o "1-2" \h \z \u </w:instrText>
+          </w:r>
+          <w:r>
+            <w:fldChar w:fldCharType="separate"/>
+          </w:r>
+          <w:r>
+            <w:rPr>
+              <w:i/>
+            </w:rPr>
+            <w:t xml:space="preserve">If page numbers do not appear, right-click this table and choose "Update Field" (or press F9).</w:t>
+          </w:r>
+          <w:r>
+            <w:fldChar w:fldCharType="end"/>
+          </w:r>
+        </w:p>
+      </w:sdtContent>
+    </w:sdt>
+    <w:p>
+      <w:r>
+        <w:br w:type="page"/>
       </w:r>
     </w:p>
     <w:p>
@@ -2467,7 +2634,32 @@
     </w:pPr>
     <w:rPr>
       <w:b/>
-      <w:sz w:val="36"/>
+      <w:sz w:val="48"/>
+    </w:rPr>
+  </w:style>
+  <w:style w:type="paragraph" w:styleId="Subtitle">
+    <w:name w:val="Subtitle"/>
+    <w:basedOn w:val="Normal"/>
+    <w:qFormat/>
+    <w:pPr>
+      <w:spacing w:before="120" w:after="240"/>
+      <w:jc w:val="center"/>
+    </w:pPr>
+    <w:rPr>
+      <w:i/>
+      <w:sz w:val="28"/>
+    </w:rPr>
+  </w:style>
+  <w:style w:type="paragraph" w:styleId="TitleMeta">
+    <w:name w:val="Title Meta"/>
+    <w:basedOn w:val="Normal"/>
+    <w:qFormat/>
+    <w:pPr>
+      <w:spacing w:before="60" w:after="60"/>
+      <w:jc w:val="center"/>
+    </w:pPr>
+    <w:rPr>
+      <w:sz w:val="24"/>
     </w:rPr>
   </w:style>
   <w:style w:type="paragraph" w:styleId="Heading1">
@@ -2498,6 +2690,27 @@
       <w:sz w:val="24"/>
     </w:rPr>
   </w:style>
+  <w:style w:type="paragraph" w:styleId="TOCHeading">
+    <w:name w:val="TOC Heading"/>
+    <w:basedOn w:val="Heading1"/>
+    <w:next w:val="Normal"/>
+    <w:qFormat/>
+    <w:pPr>
+      <w:spacing w:before="240" w:after="120"/>
+    </w:pPr>
+    <w:rPr>
+      <w:b/>
+      <w:sz w:val="32"/>
+    </w:rPr>
+  </w:style>
+  <w:style w:type="paragraph" w:styleId="TOC1">
+    <w:name w:val="toc 1"/>
+    <w:basedOn w:val="Normal"/>
+    <w:next w:val="Normal"/>
+    <w:pPr>
+      <w:spacing w:after="100"/>
+    </w:pPr>
+  </w:style>
   <w:style w:type="paragraph" w:styleId="Quote">
     <w:name w:val="Quote"/>
     <w:basedOn w:val="Normal"/>

</xml_diff>